<commit_message>
Add SRTP defense presentation deck
</commit_message>
<xml_diff>
--- a/docs/重庆大学SRTP结项报告_汽车外观设计辅助系统.docx
+++ b/docs/重庆大学SRTP结项报告_汽车外观设计辅助系统.docx
@@ -50,52 +50,23 @@
     </w:p>
     <w:p>
       <w:pPr>
-        <w:rPr>
+        <w:jc w:val="center"/>
+        <w:rPr>
+          <w:rFonts w:ascii="黑体" w:eastAsia="黑体" w:hAnsi="黑体"/>
+          <w:sz w:val="36"/>
+          <w:szCs w:val="36"/>
           <w:lang w:eastAsia="zh-CN"/>
         </w:rPr>
       </w:pPr>
-    </w:p>
-    <w:p>
-      <w:pPr>
-        <w:jc w:val="center"/>
-        <w:rPr>
-          <w:lang w:eastAsia="zh-CN"/>
-        </w:rPr>
-      </w:pPr>
-      <w:r>
-        <w:rPr>
-          <w:rFonts w:eastAsia="黑体"/>
-          <w:b/>
+      <w:r>
+        <w:rPr>
+          <w:rFonts w:ascii="黑体" w:eastAsia="黑体" w:hAnsi="黑体"/>
           <w:sz w:val="36"/>
-          <w:lang w:eastAsia="zh-CN"/>
-        </w:rPr>
-        <w:t>基于</w:t>
-      </w:r>
-      <w:r>
-        <w:rPr>
-          <w:rFonts w:eastAsia="黑体"/>
-          <w:b/>
-          <w:sz w:val="36"/>
-          <w:lang w:eastAsia="zh-CN"/>
-        </w:rPr>
-        <w:t xml:space="preserve"> StyleGAN2-ADA </w:t>
-      </w:r>
-      <w:r>
-        <w:rPr>
-          <w:rFonts w:eastAsia="黑体"/>
-          <w:b/>
-          <w:sz w:val="36"/>
-          <w:lang w:eastAsia="zh-CN"/>
-        </w:rPr>
-        <w:t>的汽车外观设计辅助系统设计与实现</w:t>
-      </w:r>
-    </w:p>
-    <w:p>
-      <w:pPr>
-        <w:rPr>
-          <w:lang w:eastAsia="zh-CN"/>
-        </w:rPr>
-      </w:pPr>
+          <w:szCs w:val="36"/>
+          <w:lang w:eastAsia="zh-CN"/>
+        </w:rPr>
+        <w:t>基于生成对抗网络的汽车造型设计辅助系统的开发</w:t>
+      </w:r>
     </w:p>
     <w:p>
       <w:pPr>
@@ -166,7 +137,7 @@
                 <w:sz w:val="21"/>
                 <w:lang w:eastAsia="zh-CN"/>
               </w:rPr>
-              <w:t>汽车外观设计辅助系统</w:t>
+              <w:t>基于生成对抗网络的汽车造型设计辅助系统的开发</w:t>
             </w:r>
           </w:p>
         </w:tc>
@@ -223,7 +194,6 @@
             <w:pPr>
               <w:jc w:val="center"/>
               <w:rPr>
-                <w:rFonts w:hint="eastAsia"/>
                 <w:lang w:eastAsia="zh-CN"/>
               </w:rPr>
             </w:pPr>
@@ -246,7 +216,6 @@
           <w:p>
             <w:pPr>
               <w:rPr>
-                <w:rFonts w:hint="eastAsia"/>
                 <w:lang w:eastAsia="zh-CN"/>
               </w:rPr>
             </w:pPr>
@@ -326,7 +295,6 @@
           <w:p>
             <w:pPr>
               <w:rPr>
-                <w:rFonts w:hint="eastAsia"/>
                 <w:lang w:eastAsia="zh-CN"/>
               </w:rPr>
             </w:pPr>
@@ -6893,9 +6861,11 @@
       <w:r>
         <w:t xml:space="preserve">StyleGAN2-ADA </w:t>
       </w:r>
+      <w:proofErr w:type="spellStart"/>
       <w:r>
         <w:t>代码路径在</w:t>
       </w:r>
+      <w:proofErr w:type="spellEnd"/>
       <w:r>
         <w:t xml:space="preserve"> _internal </w:t>
       </w:r>
@@ -9155,6 +9125,56 @@
     </w:sectPr>
   </w:body>
 </w:document>
+</file>
+
+<file path=word/endnotes.xml><?xml version="1.0" encoding="utf-8"?>
+<w:endnotes xmlns:wpc="http://schemas.microsoft.com/office/word/2010/wordprocessingCanvas" xmlns:cx="http://schemas.microsoft.com/office/drawing/2014/chartex" xmlns:cx1="http://schemas.microsoft.com/office/drawing/2015/9/8/chartex" xmlns:cx2="http://schemas.microsoft.com/office/drawing/2015/10/21/chartex" xmlns:cx3="http://schemas.microsoft.com/office/drawing/2016/5/9/chartex" xmlns:cx4="http://schemas.microsoft.com/office/drawing/2016/5/10/chartex" xmlns:cx5="http://schemas.microsoft.com/office/drawing/2016/5/11/chartex" xmlns:cx6="http://schemas.microsoft.com/office/drawing/2016/5/12/chartex" xmlns:cx7="http://schemas.microsoft.com/office/drawing/2016/5/13/chartex" xmlns:cx8="http://schemas.microsoft.com/office/drawing/2016/5/14/chartex" xmlns:mc="http://schemas.openxmlformats.org/markup-compatibility/2006" xmlns:aink="http://schemas.microsoft.com/office/drawing/2016/ink" xmlns:am3d="http://schemas.microsoft.com/office/drawing/2017/model3d" xmlns:o="urn:schemas-microsoft-com:office:office" xmlns:oel="http://schemas.microsoft.com/office/2019/extlst" xmlns:r="http://schemas.openxmlformats.org/officeDocument/2006/relationships" xmlns:m="http://schemas.openxmlformats.org/officeDocument/2006/math" xmlns:v="urn:schemas-microsoft-com:vml" xmlns:wp14="http://schemas.microsoft.com/office/word/2010/wordprocessingDrawing" xmlns:wp="http://schemas.openxmlformats.org/drawingml/2006/wordprocessingDrawing" xmlns:w10="urn:schemas-microsoft-com:office:word" xmlns:w="http://schemas.openxmlformats.org/wordprocessingml/2006/main" xmlns:w14="http://schemas.microsoft.com/office/word/2010/wordml" xmlns:w15="http://schemas.microsoft.com/office/word/2012/wordml" xmlns:w16cex="http://schemas.microsoft.com/office/word/2018/wordml/cex" xmlns:w16cid="http://schemas.microsoft.com/office/word/2016/wordml/cid" xmlns:w16="http://schemas.microsoft.com/office/word/2018/wordml" xmlns:w16sdtdh="http://schemas.microsoft.com/office/word/2020/wordml/sdtdatahash" xmlns:w16se="http://schemas.microsoft.com/office/word/2015/wordml/symex" xmlns:wpg="http://schemas.microsoft.com/office/word/2010/wordprocessingGroup" xmlns:wpi="http://schemas.microsoft.com/office/word/2010/wordprocessingInk" xmlns:wne="http://schemas.microsoft.com/office/word/2006/wordml" xmlns:wps="http://schemas.microsoft.com/office/word/2010/wordprocessingShape" mc:Ignorable="w14 w15 w16se w16cid w16 w16cex w16sdtdh wp14">
+  <w:endnote w:type="separator" w:id="-1">
+    <w:p>
+      <w:pPr>
+        <w:spacing w:after="0" w:line="240" w:lineRule="auto"/>
+      </w:pPr>
+      <w:r>
+        <w:separator/>
+      </w:r>
+    </w:p>
+  </w:endnote>
+  <w:endnote w:type="continuationSeparator" w:id="0">
+    <w:p>
+      <w:pPr>
+        <w:spacing w:after="0" w:line="240" w:lineRule="auto"/>
+      </w:pPr>
+      <w:r>
+        <w:continuationSeparator/>
+      </w:r>
+    </w:p>
+  </w:endnote>
+</w:endnotes>
+</file>
+
+<file path=word/footnotes.xml><?xml version="1.0" encoding="utf-8"?>
+<w:footnotes xmlns:wpc="http://schemas.microsoft.com/office/word/2010/wordprocessingCanvas" xmlns:cx="http://schemas.microsoft.com/office/drawing/2014/chartex" xmlns:cx1="http://schemas.microsoft.com/office/drawing/2015/9/8/chartex" xmlns:cx2="http://schemas.microsoft.com/office/drawing/2015/10/21/chartex" xmlns:cx3="http://schemas.microsoft.com/office/drawing/2016/5/9/chartex" xmlns:cx4="http://schemas.microsoft.com/office/drawing/2016/5/10/chartex" xmlns:cx5="http://schemas.microsoft.com/office/drawing/2016/5/11/chartex" xmlns:cx6="http://schemas.microsoft.com/office/drawing/2016/5/12/chartex" xmlns:cx7="http://schemas.microsoft.com/office/drawing/2016/5/13/chartex" xmlns:cx8="http://schemas.microsoft.com/office/drawing/2016/5/14/chartex" xmlns:mc="http://schemas.openxmlformats.org/markup-compatibility/2006" xmlns:aink="http://schemas.microsoft.com/office/drawing/2016/ink" xmlns:am3d="http://schemas.microsoft.com/office/drawing/2017/model3d" xmlns:o="urn:schemas-microsoft-com:office:office" xmlns:oel="http://schemas.microsoft.com/office/2019/extlst" xmlns:r="http://schemas.openxmlformats.org/officeDocument/2006/relationships" xmlns:m="http://schemas.openxmlformats.org/officeDocument/2006/math" xmlns:v="urn:schemas-microsoft-com:vml" xmlns:wp14="http://schemas.microsoft.com/office/word/2010/wordprocessingDrawing" xmlns:wp="http://schemas.openxmlformats.org/drawingml/2006/wordprocessingDrawing" xmlns:w10="urn:schemas-microsoft-com:office:word" xmlns:w="http://schemas.openxmlformats.org/wordprocessingml/2006/main" xmlns:w14="http://schemas.microsoft.com/office/word/2010/wordml" xmlns:w15="http://schemas.microsoft.com/office/word/2012/wordml" xmlns:w16cex="http://schemas.microsoft.com/office/word/2018/wordml/cex" xmlns:w16cid="http://schemas.microsoft.com/office/word/2016/wordml/cid" xmlns:w16="http://schemas.microsoft.com/office/word/2018/wordml" xmlns:w16sdtdh="http://schemas.microsoft.com/office/word/2020/wordml/sdtdatahash" xmlns:w16se="http://schemas.microsoft.com/office/word/2015/wordml/symex" xmlns:wpg="http://schemas.microsoft.com/office/word/2010/wordprocessingGroup" xmlns:wpi="http://schemas.microsoft.com/office/word/2010/wordprocessingInk" xmlns:wne="http://schemas.microsoft.com/office/word/2006/wordml" xmlns:wps="http://schemas.microsoft.com/office/word/2010/wordprocessingShape" mc:Ignorable="w14 w15 w16se w16cid w16 w16cex w16sdtdh wp14">
+  <w:footnote w:type="separator" w:id="-1">
+    <w:p>
+      <w:pPr>
+        <w:spacing w:after="0" w:line="240" w:lineRule="auto"/>
+      </w:pPr>
+      <w:r>
+        <w:separator/>
+      </w:r>
+    </w:p>
+  </w:footnote>
+  <w:footnote w:type="continuationSeparator" w:id="0">
+    <w:p>
+      <w:pPr>
+        <w:spacing w:after="0" w:line="240" w:lineRule="auto"/>
+      </w:pPr>
+      <w:r>
+        <w:continuationSeparator/>
+      </w:r>
+    </w:p>
+  </w:footnote>
+</w:footnotes>
 </file>
 
 <file path=word/numbering.xml><?xml version="1.0" encoding="utf-8"?>
@@ -9967,7 +9987,6 @@
   <w:style w:type="character" w:default="1" w:styleId="a2">
     <w:name w:val="Default Paragraph Font"/>
     <w:uiPriority w:val="1"/>
-    <w:semiHidden/>
     <w:unhideWhenUsed/>
   </w:style>
   <w:style w:type="table" w:default="1" w:styleId="a3">

</xml_diff>